<commit_message>
Week 2: round-2 labels, kappa 1.0 (same-day re-label, disclosed)
Co-Authored-By: Claude Opus 5.5 <noreply@anthropic.com>
</commit_message>
<xml_diff>
--- a/W02_Evaluation_Report.docx
+++ b/W02_Evaluation_Report.docx
@@ -1042,7 +1042,7 @@
     </w:p>
     <w:p>
       <w:r>
-        <w:t>Second-round labels not yet complete.</w:t>
+        <w:t>Cohen's kappa on 50 double-labelled reports: 1.00 (raw agreement 100.0%).</w:t>
       </w:r>
     </w:p>
     <w:p>
@@ -1433,6 +1433,14 @@
         <w:t>**One likely gold-label error on the tuning split:** R01477 ("heart-rate reading 49 BPM, resident was fine") was labelled NO_INCIDENT; under the S5 rule it is an AI detection error.</w:t>
       </w:r>
     </w:p>
+    <w:p>
+      <w:pPr>
+        <w:pStyle w:val="ListBullet"/>
+      </w:pPr>
+      <w:r>
+        <w:t>Label consistency: on the 50 double-labelled reports my second round matched the first exactly (kappa 1.0 for category and severity). This overstates reliability: the second round was done the same day as the first, so I likely remembered many answers, and it is one labeller, not two. A fair test is a second labeller, or a re-label after at least a week.</w:t>
+      </w:r>
+    </w:p>
     <w:sectPr>
       <w:pgSz w:w="12240" w:h="15840"/>
       <w:pgMar w:top="1440" w:right="1800" w:bottom="1440" w:left="1800" w:header="720" w:footer="720" w:gutter="0"/>

</xml_diff>